<commit_message>
Rescue checklist: blank line before each list so the Word download shows separate bullets (layout only, no wording change; flagged by the polish check)
</commit_message>
<xml_diff>
--- a/public/templates/paid-rewrite-rescue-checklist.docx
+++ b/public/templates/paid-rewrite-rescue-checklist.docx
@@ -266,23 +266,41 @@
       <w:r>
         <w:t xml:space="preserve">Count your KEEP lines against your FIX + MISSING lines.</w:t>
       </w:r>
-      <w:r>
-        <w:t xml:space="preserve"> </w:t>
-      </w:r>
-      <w:r>
-        <w:t xml:space="preserve">- Mostly KEEP: the rewrite mostly worked — send one precise note per FIX line and finish it.</w:t>
-      </w:r>
-      <w:r>
-        <w:t xml:space="preserve"> </w:t>
-      </w:r>
-      <w:r>
-        <w:t xml:space="preserve">- Mostly FIX: one more round, with line-by-line notes (one change per note, tied to a specific line).</w:t>
-      </w:r>
-      <w:r>
-        <w:t xml:space="preserve"> </w:t>
-      </w:r>
-      <w:r>
-        <w:t xml:space="preserve">- Mostly MISSING: the service reformatted instead of rewriting. Stop chasing; rebuild from your real experience.</w:t>
+    </w:p>
+    <w:p>
+      <w:pPr>
+        <w:pStyle w:val="Compact"/>
+        <w:numPr>
+          <w:ilvl w:val="0"/>
+          <w:numId w:val="1012"/>
+        </w:numPr>
+      </w:pPr>
+      <w:r>
+        <w:t xml:space="preserve">Mostly KEEP: the rewrite mostly worked — send one precise note per FIX line and finish it.</w:t>
+      </w:r>
+    </w:p>
+    <w:p>
+      <w:pPr>
+        <w:pStyle w:val="Compact"/>
+        <w:numPr>
+          <w:ilvl w:val="0"/>
+          <w:numId w:val="1012"/>
+        </w:numPr>
+      </w:pPr>
+      <w:r>
+        <w:t xml:space="preserve">Mostly FIX: one more round, with line-by-line notes (one change per note, tied to a specific line).</w:t>
+      </w:r>
+    </w:p>
+    <w:p>
+      <w:pPr>
+        <w:pStyle w:val="Compact"/>
+        <w:numPr>
+          <w:ilvl w:val="0"/>
+          <w:numId w:val="1012"/>
+        </w:numPr>
+      </w:pPr>
+      <w:r>
+        <w:t xml:space="preserve">Mostly MISSING: the service reformatted instead of rewriting. Stop chasing; rebuild from your real experience.</w:t>
       </w:r>
     </w:p>
     <w:bookmarkEnd w:id="12"/>
@@ -489,6 +507,109 @@
       <w:pPr>
         <w:ind w:left="6480" w:hanging="360"/>
       </w:pPr>
+    </w:lvl>
+  </w:abstractNum>
+  <w:abstractNum w:abstractNumId="991">
+    <w:nsid w:val="0000A991"/>
+    <w:multiLevelType w:val="multilevel"/>
+    <w:lvl w:ilvl="0">
+      <w:numFmt w:val="bullet"/>
+      <w:lvlText w:val=""/>
+      <w:lvlJc w:val="left"/>
+      <w:pPr>
+        <w:ind w:left="720" w:hanging="360"/>
+      </w:pPr>
+      <w:rPr>
+        <w:rFonts w:ascii="Symbol" w:hAnsi="Symbol" w:cs="Symbol" w:hint="default"/>
+      </w:rPr>
+    </w:lvl>
+    <w:lvl w:ilvl="1">
+      <w:numFmt w:val="bullet"/>
+      <w:lvlText w:val="o"/>
+      <w:lvlJc w:val="left"/>
+      <w:pPr>
+        <w:ind w:left="1440" w:hanging="360"/>
+      </w:pPr>
+      <w:rPr>
+        <w:rFonts w:ascii="Courier New" w:hAnsi="Courier New" w:cs="Courier New" w:hint="default"/>
+      </w:rPr>
+    </w:lvl>
+    <w:lvl w:ilvl="2">
+      <w:numFmt w:val="bullet"/>
+      <w:lvlText w:val=""/>
+      <w:lvlJc w:val="left"/>
+      <w:pPr>
+        <w:ind w:left="2160" w:hanging="360"/>
+      </w:pPr>
+      <w:rPr>
+        <w:rFonts w:ascii="Wingdings" w:hAnsi="Wingdings" w:cs="Wingdings" w:hint="default"/>
+      </w:rPr>
+    </w:lvl>
+    <w:lvl w:ilvl="3">
+      <w:numFmt w:val="bullet"/>
+      <w:lvlText w:val=""/>
+      <w:lvlJc w:val="left"/>
+      <w:pPr>
+        <w:ind w:left="2880" w:hanging="360"/>
+      </w:pPr>
+      <w:rPr>
+        <w:rFonts w:ascii="Symbol" w:hAnsi="Symbol" w:cs="Symbol" w:hint="default"/>
+      </w:rPr>
+    </w:lvl>
+    <w:lvl w:ilvl="4">
+      <w:numFmt w:val="bullet"/>
+      <w:lvlText w:val="o"/>
+      <w:lvlJc w:val="left"/>
+      <w:pPr>
+        <w:ind w:left="3600" w:hanging="360"/>
+      </w:pPr>
+      <w:rPr>
+        <w:rFonts w:ascii="Courier New" w:hAnsi="Courier New" w:cs="Courier New" w:hint="default"/>
+      </w:rPr>
+    </w:lvl>
+    <w:lvl w:ilvl="5">
+      <w:numFmt w:val="bullet"/>
+      <w:lvlText w:val=""/>
+      <w:lvlJc w:val="left"/>
+      <w:pPr>
+        <w:ind w:left="4320" w:hanging="360"/>
+      </w:pPr>
+      <w:rPr>
+        <w:rFonts w:ascii="Wingdings" w:hAnsi="Wingdings" w:cs="Wingdings" w:hint="default"/>
+      </w:rPr>
+    </w:lvl>
+    <w:lvl w:ilvl="6">
+      <w:numFmt w:val="bullet"/>
+      <w:lvlText w:val=""/>
+      <w:lvlJc w:val="left"/>
+      <w:pPr>
+        <w:ind w:left="5040" w:hanging="360"/>
+      </w:pPr>
+      <w:rPr>
+        <w:rFonts w:ascii="Symbol" w:hAnsi="Symbol" w:cs="Symbol" w:hint="default"/>
+      </w:rPr>
+    </w:lvl>
+    <w:lvl w:ilvl="7">
+      <w:numFmt w:val="bullet"/>
+      <w:lvlText w:val="o"/>
+      <w:lvlJc w:val="left"/>
+      <w:pPr>
+        <w:ind w:left="5760" w:hanging="360"/>
+      </w:pPr>
+      <w:rPr>
+        <w:rFonts w:ascii="Courier New" w:hAnsi="Courier New" w:cs="Courier New" w:hint="default"/>
+      </w:rPr>
+    </w:lvl>
+    <w:lvl w:ilvl="8">
+      <w:numFmt w:val="bullet"/>
+      <w:lvlText w:val=""/>
+      <w:lvlJc w:val="left"/>
+      <w:pPr>
+        <w:ind w:left="6480" w:hanging="360"/>
+      </w:pPr>
+      <w:rPr>
+        <w:rFonts w:ascii="Wingdings" w:hAnsi="Wingdings" w:cs="Wingdings" w:hint="default"/>
+      </w:rPr>
     </w:lvl>
   </w:abstractNum>
   <w:num w:numId="1000">
@@ -526,6 +647,9 @@
   </w:num>
   <w:num w:numId="1011">
     <w:abstractNumId w:val="992"/>
+  </w:num>
+  <w:num w:numId="1012">
+    <w:abstractNumId w:val="991"/>
   </w:num>
 </w:numbering>
 </file>

</xml_diff>